<commit_message>
Scraping report: document finalized tag-extraction pipeline
Updated the Tag extraction section to accurately describe the current
tagging flow after today's Option C work:

- strip_boilerplate() now applied BEFORE both the AI extractor and the
  regex fallback (not just the regex fallback as originally documented)
- All five internal fallback paths in tag_extractor.extract_tags_with_evidence
  use the stripped body (no client, API error, JSON parse error,
  non-array response, AI-returns-zero safety net)
- retag_strict.py also uses strip_boilerplate
- AI extractor evidence validation still runs against the ORIGINAL
  source text so cited phrases must be real; the model's INPUT is
  cleaned, but validation checks against the full source

Regenerated SCRAPING_REPORT.md and .docx from the updated template.

Co-Authored-By: Claude Opus 4.6 <noreply@anthropic.com>
</commit_message>
<xml_diff>
--- a/SCRAPING_REPORT.docx
+++ b/SCRAPING_REPORT.docx
@@ -12,7 +12,7 @@
     </w:p>
     <w:p>
       <w:r>
-        <w:t xml:space="preserve">*Auto-generated 2026-04-20 09:17 UTC from </w:t>
+        <w:t xml:space="preserve">*Auto-generated 2026-04-20 09:27 UTC from </w:t>
       </w:r>
       <w:r>
         <w:rPr>
@@ -1967,6 +1967,108 @@
     </w:p>
     <w:p>
       <w:r>
+        <w:rPr>
+          <w:b/>
+        </w:rPr>
+        <w:t>Also for Congress (not in `FEEDS[]`, runs as a separate workflow):</w:t>
+      </w:r>
+    </w:p>
+    <w:p>
+      <w:pPr>
+        <w:pStyle w:val="ListBullet"/>
+      </w:pPr>
+      <w:r/>
+      <w:r>
+        <w:rPr>
+          <w:b/>
+        </w:rPr>
+        <w:t>`scrape_congress_hearings.py`</w:t>
+      </w:r>
+      <w:r>
+        <w:t xml:space="preserve"> — standalone pipeline querying the Congress.gov API at </w:t>
+      </w:r>
+      <w:r>
+        <w:rPr>
+          <w:rFonts w:ascii="Consolas" w:hAnsi="Consolas"/>
+          <w:sz w:val="20"/>
+        </w:rPr>
+        <w:t>api.congress.gov/v3/committee-meeting/</w:t>
+      </w:r>
+      <w:r>
+        <w:t xml:space="preserve">. Extracts HC-fraud-relevant hearings by title keywords, committee routing (House Oversight, Senate HELP, House E&amp;C, etc.), and witness signals. Auto-commits confident items to </w:t>
+      </w:r>
+      <w:r>
+        <w:rPr>
+          <w:rFonts w:ascii="Consolas" w:hAnsi="Consolas"/>
+          <w:sz w:val="20"/>
+        </w:rPr>
+        <w:t>actions.json</w:t>
+      </w:r>
+      <w:r>
+        <w:t xml:space="preserve"> as </w:t>
+      </w:r>
+      <w:r>
+        <w:rPr>
+          <w:rFonts w:ascii="Consolas" w:hAnsi="Consolas"/>
+          <w:sz w:val="20"/>
+        </w:rPr>
+        <w:t>type=Hearing</w:t>
+      </w:r>
+      <w:r>
+        <w:t>; ambiguous items go to a review-queue artifact (not committed, 30-day retention on GitHub Actions).</w:t>
+      </w:r>
+    </w:p>
+    <w:p>
+      <w:pPr>
+        <w:pStyle w:val="ListBullet2"/>
+      </w:pPr>
+      <w:r/>
+      <w:r>
+        <w:t xml:space="preserve">Scheduled daily at </w:t>
+      </w:r>
+      <w:r>
+        <w:rPr>
+          <w:b/>
+        </w:rPr>
+        <w:t>9:13 UTC</w:t>
+      </w:r>
+      <w:r>
+        <w:t xml:space="preserve"> via </w:t>
+      </w:r>
+      <w:r>
+        <w:rPr>
+          <w:rFonts w:ascii="Consolas" w:hAnsi="Consolas"/>
+          <w:sz w:val="20"/>
+        </w:rPr>
+        <w:t>hearings-update.yml</w:t>
+      </w:r>
+    </w:p>
+    <w:p>
+      <w:pPr>
+        <w:pStyle w:val="ListBullet2"/>
+      </w:pPr>
+      <w:r/>
+      <w:r>
+        <w:t xml:space="preserve">Requires </w:t>
+      </w:r>
+      <w:r>
+        <w:rPr>
+          <w:rFonts w:ascii="Consolas" w:hAnsi="Consolas"/>
+          <w:sz w:val="20"/>
+        </w:rPr>
+        <w:t>CONGRESS_GOV_API_KEY</w:t>
+      </w:r>
+      <w:r>
+        <w:t xml:space="preserve"> secret</w:t>
+      </w:r>
+    </w:p>
+    <w:p>
+      <w:r>
+        <w:t>This is separate from the committee press-release scrapers listed above — a given congressional hearing may produce both a hearing item (from Congress.gov API) and a committee press release (from the committee scraper) with different URLs.</w:t>
+      </w:r>
+    </w:p>
+    <w:p>
+      <w:r>
         <w:t>__________________________________________________</w:t>
       </w:r>
     </w:p>
@@ -2219,7 +2321,7 @@
         <w:t>Boilerplate stripping (`tag_allowlist.strip_boilerplate`)</w:t>
       </w:r>
       <w:r>
-        <w:t>: before regex matching runs against body text, known DOJ boilerplate passages are blanked out. This suppresses the false-positive pattern where a pure Medicare DME case gets tagged ACA because the standard Strike Force closing paragraph enumerates "Medicare, Medicaid, and the Affordable Care Act." Patterns targeted:</w:t>
+        <w:t>: before either the AI extractor or the regex matcher runs against body text, known DOJ boilerplate passages are blanked out. This suppresses the false-positive pattern where a pure Medicare DME case gets tagged ACA because the standard Strike Force closing paragraph enumerates "Medicare, Medicaid, and the Affordable Care Act." Patterns stripped:</w:t>
       </w:r>
     </w:p>
     <w:p>
@@ -2287,7 +2389,117 @@
     </w:p>
     <w:p>
       <w:r>
+        <w:rPr>
+          <w:b/>
+        </w:rPr>
+        <w:t>Where it's applied</w:t>
+      </w:r>
+      <w:r>
+        <w:t xml:space="preserve"> (defense-in-depth, both paths):</w:t>
+      </w:r>
+    </w:p>
+    <w:p>
+      <w:pPr>
+        <w:pStyle w:val="ListBullet"/>
+      </w:pPr>
+      <w:r/>
+      <w:r>
+        <w:rPr>
+          <w:rFonts w:ascii="Consolas" w:hAnsi="Consolas"/>
+          <w:sz w:val="20"/>
+        </w:rPr>
+        <w:t>update.py</w:t>
+      </w:r>
+      <w:r>
+        <w:t xml:space="preserve"> </w:t>
+      </w:r>
+      <w:r>
+        <w:rPr>
+          <w:rFonts w:ascii="Consolas" w:hAnsi="Consolas"/>
+          <w:sz w:val="20"/>
+        </w:rPr>
+        <w:t>generate_tags</w:t>
+      </w:r>
+      <w:r>
+        <w:t xml:space="preserve">: regex fallback receives </w:t>
+      </w:r>
+      <w:r>
+        <w:rPr>
+          <w:rFonts w:ascii="Consolas" w:hAnsi="Consolas"/>
+          <w:sz w:val="20"/>
+        </w:rPr>
+        <w:t>strip_boilerplate(full_text)</w:t>
+      </w:r>
+      <w:r>
+        <w:t xml:space="preserve"> instead of raw text</w:t>
+      </w:r>
+    </w:p>
+    <w:p>
+      <w:pPr>
+        <w:pStyle w:val="ListBullet"/>
+      </w:pPr>
+      <w:r/>
+      <w:r>
+        <w:rPr>
+          <w:rFonts w:ascii="Consolas" w:hAnsi="Consolas"/>
+          <w:sz w:val="20"/>
+        </w:rPr>
+        <w:t>tag_extractor.extract_tags_with_evidence</w:t>
+      </w:r>
+      <w:r>
+        <w:t>: the AI receives the stripped text as its INPUT; evidence validation still runs against the ORIGINAL text so cited phrases must match the real source. All five internal fallback paths (no client, API error, JSON parse error, non-array response, AI-returns-zero safety net) also use the stripped body.</w:t>
+      </w:r>
+    </w:p>
+    <w:p>
+      <w:pPr>
+        <w:pStyle w:val="ListBullet"/>
+      </w:pPr>
+      <w:r/>
+      <w:r>
+        <w:rPr>
+          <w:rFonts w:ascii="Consolas" w:hAnsi="Consolas"/>
+          <w:sz w:val="20"/>
+        </w:rPr>
+        <w:t>retag_strict.py</w:t>
+      </w:r>
+      <w:r>
+        <w:t xml:space="preserve"> </w:t>
+      </w:r>
+      <w:r>
+        <w:rPr>
+          <w:rFonts w:ascii="Consolas" w:hAnsi="Consolas"/>
+          <w:sz w:val="20"/>
+        </w:rPr>
+        <w:t>strict_tags_for</w:t>
+      </w:r>
+      <w:r>
+        <w:t xml:space="preserve">: also applies </w:t>
+      </w:r>
+      <w:r>
+        <w:rPr>
+          <w:rFonts w:ascii="Consolas" w:hAnsi="Consolas"/>
+          <w:sz w:val="20"/>
+        </w:rPr>
+        <w:t>strip_boilerplate</w:t>
+      </w:r>
+      <w:r>
+        <w:t xml:space="preserve"> before running the regex matcher.</w:t>
+      </w:r>
+    </w:p>
+    <w:p>
+      <w:r>
         <w:t>After boilerplate strip, program and area tags both require just 1+ keyword occurrence in the remaining body text. Because boilerplate is removed first, the single-occurrence threshold no longer produces the old false-positive noise.</w:t>
+      </w:r>
+    </w:p>
+    <w:p>
+      <w:r>
+        <w:rPr>
+          <w:b/>
+        </w:rPr>
+        <w:t>AI extractor evidence rule</w:t>
+      </w:r>
+      <w:r>
+        <w:t>: for every tag selected, the model must cite a verbatim 8+-word phrase from the source. Each phrase is validated by substring-match against the original text; unmatched phrases are dropped. This means the model cannot hallucinate a tag without real textual grounding.</w:t>
       </w:r>
     </w:p>
     <w:p>

</xml_diff>